<commit_message>
fixing dependaces and api
</commit_message>
<xml_diff>
--- a/Gotera_Case_Study_Report.docx
+++ b/Gotera_Case_Study_Report.docx
@@ -65,7 +65,7 @@
       <w:tr>
         <w:tc>
           <w:tcPr>
-            <w:tcW w:type="dxa" w:w="2880"/>
+            <w:tcW w:type="dxa" w:w="3168"/>
             <w:tcMar>
               <w:top w:w="40" w:type="dxa"/>
               <w:bottom w:w="40" w:type="dxa"/>
@@ -87,7 +87,7 @@
         </w:tc>
         <w:tc>
           <w:tcPr>
-            <w:tcW w:type="dxa" w:w="6480"/>
+            <w:tcW w:type="dxa" w:w="6192"/>
             <w:tcMar>
               <w:top w:w="40" w:type="dxa"/>
               <w:bottom w:w="40" w:type="dxa"/>
@@ -108,7 +108,7 @@
       <w:tr>
         <w:tc>
           <w:tcPr>
-            <w:tcW w:type="dxa" w:w="2880"/>
+            <w:tcW w:type="dxa" w:w="3168"/>
             <w:tcMar>
               <w:top w:w="40" w:type="dxa"/>
               <w:bottom w:w="40" w:type="dxa"/>
@@ -129,7 +129,7 @@
         </w:tc>
         <w:tc>
           <w:tcPr>
-            <w:tcW w:type="dxa" w:w="6480"/>
+            <w:tcW w:type="dxa" w:w="6192"/>
             <w:tcMar>
               <w:top w:w="40" w:type="dxa"/>
               <w:bottom w:w="40" w:type="dxa"/>
@@ -150,7 +150,7 @@
       <w:tr>
         <w:tc>
           <w:tcPr>
-            <w:tcW w:type="dxa" w:w="2880"/>
+            <w:tcW w:type="dxa" w:w="3168"/>
             <w:tcMar>
               <w:top w:w="40" w:type="dxa"/>
               <w:bottom w:w="40" w:type="dxa"/>
@@ -165,13 +165,13 @@
                 <w:color w:val="0D382C"/>
                 <w:sz w:val="20"/>
               </w:rPr>
-              <w:t>Canonical Textbooks:</w:t>
+              <w:t>Primary Database Text:</w:t>
             </w:r>
           </w:p>
         </w:tc>
         <w:tc>
           <w:tcPr>
-            <w:tcW w:type="dxa" w:w="6480"/>
+            <w:tcW w:type="dxa" w:w="6192"/>
             <w:tcMar>
               <w:top w:w="40" w:type="dxa"/>
               <w:bottom w:w="40" w:type="dxa"/>
@@ -184,7 +184,7 @@
               <w:rPr>
                 <w:sz w:val="20"/>
               </w:rPr>
-              <w:t>MongoDB in Action, Web Dev with Node &amp; Express, Learning React, CSS in Depth, HTML5 Patterns</w:t>
+              <w:t>MongoDB 8.0 in Action, Third Edition: Building on the Atlas Data Platform by Arek Borucki (Manning)</w:t>
             </w:r>
           </w:p>
         </w:tc>
@@ -192,7 +192,7 @@
       <w:tr>
         <w:tc>
           <w:tcPr>
-            <w:tcW w:type="dxa" w:w="2880"/>
+            <w:tcW w:type="dxa" w:w="3168"/>
             <w:tcMar>
               <w:top w:w="40" w:type="dxa"/>
               <w:bottom w:w="40" w:type="dxa"/>
@@ -213,7 +213,7 @@
         </w:tc>
         <w:tc>
           <w:tcPr>
-            <w:tcW w:type="dxa" w:w="6480"/>
+            <w:tcW w:type="dxa" w:w="6192"/>
             <w:tcMar>
               <w:top w:w="40" w:type="dxa"/>
               <w:bottom w:w="40" w:type="dxa"/>
@@ -273,7 +273,7 @@
     </w:p>
     <w:p>
       <w:r>
-        <w:t>The following matrix summarizes how every layer of Gotera maps directly to one of the five required reference textbooks:</w:t>
+        <w:t>The following matrix summarizes how every layer of Gotera maps directly to one of the five required reference textbooks, with explicit chapter references for the persistence layer:</w:t>
       </w:r>
     </w:p>
     <w:tbl>
@@ -290,7 +290,7 @@
       <w:tr>
         <w:tc>
           <w:tcPr>
-            <w:tcW w:type="dxa" w:w="2880"/>
+            <w:tcW w:type="dxa" w:w="3168"/>
             <w:shd w:fill="0D382C"/>
             <w:tcMar>
               <w:top w:w="120" w:type="dxa"/>
@@ -312,7 +312,7 @@
         </w:tc>
         <w:tc>
           <w:tcPr>
-            <w:tcW w:type="dxa" w:w="3168"/>
+            <w:tcW w:type="dxa" w:w="2880"/>
             <w:shd w:fill="0D382C"/>
             <w:tcMar>
               <w:top w:w="120" w:type="dxa"/>
@@ -350,12 +350,34 @@
                 <w:color w:val="FFFFFF"/>
                 <w:sz w:val="19"/>
               </w:rPr>
-              <w:t>Gotera Implementation</w:t>
+              <w:t>Gotera Implementation &amp; Chapters</w:t>
             </w:r>
           </w:p>
         </w:tc>
       </w:tr>
       <w:tr>
+        <w:tc>
+          <w:tcPr>
+            <w:tcW w:type="dxa" w:w="3168"/>
+            <w:shd w:fill="FFFFFF"/>
+            <w:tcMar>
+              <w:top w:w="100" w:type="dxa"/>
+              <w:bottom w:w="100" w:type="dxa"/>
+              <w:left w:w="100" w:type="dxa"/>
+              <w:right w:w="100" w:type="dxa"/>
+            </w:tcMar>
+          </w:tcPr>
+          <w:p>
+            <w:r>
+              <w:rPr>
+                <w:b/>
+                <w:color w:val="0D382C"/>
+                <w:sz w:val="17"/>
+              </w:rPr>
+              <w:t>MongoDB 8.0 in Action, Third Edition: Building on the Atlas Data Platform by Arek Borucki (Manning)</w:t>
+            </w:r>
+          </w:p>
+        </w:tc>
         <w:tc>
           <w:tcPr>
             <w:tcW w:type="dxa" w:w="2880"/>
@@ -370,31 +392,9 @@
           <w:p>
             <w:r>
               <w:rPr>
-                <w:b/>
-                <w:color w:val="0D382C"/>
-                <w:sz w:val="18"/>
+                <w:sz w:val="17"/>
               </w:rPr>
-              <w:t>MongoDB in Action (Manning)</w:t>
-            </w:r>
-          </w:p>
-        </w:tc>
-        <w:tc>
-          <w:tcPr>
-            <w:tcW w:type="dxa" w:w="3168"/>
-            <w:shd w:fill="FFFFFF"/>
-            <w:tcMar>
-              <w:top w:w="100" w:type="dxa"/>
-              <w:bottom w:w="100" w:type="dxa"/>
-              <w:left w:w="100" w:type="dxa"/>
-              <w:right w:w="100" w:type="dxa"/>
-            </w:tcMar>
-          </w:tcPr>
-          <w:p>
-            <w:r>
-              <w:rPr>
-                <w:sz w:val="18"/>
-              </w:rPr>
-              <w:t>Document Modeling, Querying, Validation, Indexing</w:t>
+              <w:t>Document Modeling, Atlas Platform, MQL Queries, Indexing &amp; Aggregations</w:t>
             </w:r>
           </w:p>
         </w:tc>
@@ -412,14 +412,36 @@
           <w:p>
             <w:r>
               <w:rPr>
-                <w:sz w:val="18"/>
+                <w:sz w:val="17"/>
               </w:rPr>
-              <w:t>Direct Mongoose schemas, compound indexes (category/warehouse), virtuals (capacityUsedPercent), regex filtering.</w:t>
+              <w:t>Ch. 2 &amp; 3 (Atlas cluster connection), Ch. 4 (Document modeling &amp; validation), Ch. 5 (CRUD &amp; MQL queries), Ch. 6 (Aggregation framework), Ch. 7 (Compound indexing).</w:t>
             </w:r>
           </w:p>
         </w:tc>
       </w:tr>
       <w:tr>
+        <w:tc>
+          <w:tcPr>
+            <w:tcW w:type="dxa" w:w="3168"/>
+            <w:shd w:fill="F8FAFC"/>
+            <w:tcMar>
+              <w:top w:w="100" w:type="dxa"/>
+              <w:bottom w:w="100" w:type="dxa"/>
+              <w:left w:w="100" w:type="dxa"/>
+              <w:right w:w="100" w:type="dxa"/>
+            </w:tcMar>
+          </w:tcPr>
+          <w:p>
+            <w:r>
+              <w:rPr>
+                <w:b/>
+                <w:color w:val="0D382C"/>
+                <w:sz w:val="17"/>
+              </w:rPr>
+              <w:t>Web Development with Node &amp; Express by Ethan Brown (O'Reilly)</w:t>
+            </w:r>
+          </w:p>
+        </w:tc>
         <w:tc>
           <w:tcPr>
             <w:tcW w:type="dxa" w:w="2880"/>
@@ -434,29 +456,7 @@
           <w:p>
             <w:r>
               <w:rPr>
-                <w:b/>
-                <w:color w:val="0D382C"/>
-                <w:sz w:val="18"/>
-              </w:rPr>
-              <w:t>Web Development with Node &amp; Express by Ethan Brown (O'Reilly)</w:t>
-            </w:r>
-          </w:p>
-        </w:tc>
-        <w:tc>
-          <w:tcPr>
-            <w:tcW w:type="dxa" w:w="3168"/>
-            <w:shd w:fill="F8FAFC"/>
-            <w:tcMar>
-              <w:top w:w="100" w:type="dxa"/>
-              <w:bottom w:w="100" w:type="dxa"/>
-              <w:left w:w="100" w:type="dxa"/>
-              <w:right w:w="100" w:type="dxa"/>
-            </w:tcMar>
-          </w:tcPr>
-          <w:p>
-            <w:r>
-              <w:rPr>
-                <w:sz w:val="18"/>
+                <w:sz w:val="17"/>
               </w:rPr>
               <w:t>Middleware Pipeline, Modular Routing, REST Handlers</w:t>
             </w:r>
@@ -476,7 +476,7 @@
           <w:p>
             <w:r>
               <w:rPr>
-                <w:sz w:val="18"/>
+                <w:sz w:val="17"/>
               </w:rPr>
               <w:t>Decoupled handlers/controllers, centralized error handling (404/500), CORS, structured request logging.</w:t>
             </w:r>
@@ -484,6 +484,28 @@
         </w:tc>
       </w:tr>
       <w:tr>
+        <w:tc>
+          <w:tcPr>
+            <w:tcW w:type="dxa" w:w="3168"/>
+            <w:shd w:fill="FFFFFF"/>
+            <w:tcMar>
+              <w:top w:w="100" w:type="dxa"/>
+              <w:bottom w:w="100" w:type="dxa"/>
+              <w:left w:w="100" w:type="dxa"/>
+              <w:right w:w="100" w:type="dxa"/>
+            </w:tcMar>
+          </w:tcPr>
+          <w:p>
+            <w:r>
+              <w:rPr>
+                <w:b/>
+                <w:color w:val="0D382C"/>
+                <w:sz w:val="17"/>
+              </w:rPr>
+              <w:t>Learning React by Banks &amp; Porcello (O'Reilly)</w:t>
+            </w:r>
+          </w:p>
+        </w:tc>
         <w:tc>
           <w:tcPr>
             <w:tcW w:type="dxa" w:w="2880"/>
@@ -498,29 +520,7 @@
           <w:p>
             <w:r>
               <w:rPr>
-                <w:b/>
-                <w:color w:val="0D382C"/>
-                <w:sz w:val="18"/>
-              </w:rPr>
-              <w:t>Learning React by Banks &amp; Porcello (O'Reilly)</w:t>
-            </w:r>
-          </w:p>
-        </w:tc>
-        <w:tc>
-          <w:tcPr>
-            <w:tcW w:type="dxa" w:w="3168"/>
-            <w:shd w:fill="FFFFFF"/>
-            <w:tcMar>
-              <w:top w:w="100" w:type="dxa"/>
-              <w:bottom w:w="100" w:type="dxa"/>
-              <w:left w:w="100" w:type="dxa"/>
-              <w:right w:w="100" w:type="dxa"/>
-            </w:tcMar>
-          </w:tcPr>
-          <w:p>
-            <w:r>
-              <w:rPr>
-                <w:sz w:val="18"/>
+                <w:sz w:val="17"/>
               </w:rPr>
               <w:t>Functional Components, Hooks, Controlled Inputs</w:t>
             </w:r>
@@ -540,7 +540,7 @@
           <w:p>
             <w:r>
               <w:rPr>
-                <w:sz w:val="18"/>
+                <w:sz w:val="17"/>
               </w:rPr>
               <w:t>Idiomatic functional composition, useState/useEffect data fetching, controlled forms, unidirectional data flow.</w:t>
             </w:r>
@@ -548,6 +548,28 @@
         </w:tc>
       </w:tr>
       <w:tr>
+        <w:tc>
+          <w:tcPr>
+            <w:tcW w:type="dxa" w:w="3168"/>
+            <w:shd w:fill="F8FAFC"/>
+            <w:tcMar>
+              <w:top w:w="100" w:type="dxa"/>
+              <w:bottom w:w="100" w:type="dxa"/>
+              <w:left w:w="100" w:type="dxa"/>
+              <w:right w:w="100" w:type="dxa"/>
+            </w:tcMar>
+          </w:tcPr>
+          <w:p>
+            <w:r>
+              <w:rPr>
+                <w:b/>
+                <w:color w:val="0D382C"/>
+                <w:sz w:val="17"/>
+              </w:rPr>
+              <w:t>CSS in Depth by Keith J. Grant (Manning)</w:t>
+            </w:r>
+          </w:p>
+        </w:tc>
         <w:tc>
           <w:tcPr>
             <w:tcW w:type="dxa" w:w="2880"/>
@@ -562,29 +584,7 @@
           <w:p>
             <w:r>
               <w:rPr>
-                <w:b/>
-                <w:color w:val="0D382C"/>
-                <w:sz w:val="18"/>
-              </w:rPr>
-              <w:t>CSS in Depth by Keith J. Grant (Manning)</w:t>
-            </w:r>
-          </w:p>
-        </w:tc>
-        <w:tc>
-          <w:tcPr>
-            <w:tcW w:type="dxa" w:w="3168"/>
-            <w:shd w:fill="F8FAFC"/>
-            <w:tcMar>
-              <w:top w:w="100" w:type="dxa"/>
-              <w:bottom w:w="100" w:type="dxa"/>
-              <w:left w:w="100" w:type="dxa"/>
-              <w:right w:w="100" w:type="dxa"/>
-            </w:tcMar>
-          </w:tcPr>
-          <w:p>
-            <w:r>
-              <w:rPr>
-                <w:sz w:val="18"/>
+                <w:sz w:val="17"/>
               </w:rPr>
               <w:t>Cascade, Custom Properties, Layout Modules</w:t>
             </w:r>
@@ -604,7 +604,7 @@
           <w:p>
             <w:r>
               <w:rPr>
-                <w:sz w:val="18"/>
+                <w:sz w:val="17"/>
               </w:rPr>
               <w:t>Pure CSS custom properties (:root design tokens), CSS Grid &amp; Flexbox, elevation shadows, zero Tailwind dependency.</w:t>
             </w:r>
@@ -612,6 +612,28 @@
         </w:tc>
       </w:tr>
       <w:tr>
+        <w:tc>
+          <w:tcPr>
+            <w:tcW w:type="dxa" w:w="3168"/>
+            <w:shd w:fill="FFFFFF"/>
+            <w:tcMar>
+              <w:top w:w="100" w:type="dxa"/>
+              <w:bottom w:w="100" w:type="dxa"/>
+              <w:left w:w="100" w:type="dxa"/>
+              <w:right w:w="100" w:type="dxa"/>
+            </w:tcMar>
+          </w:tcPr>
+          <w:p>
+            <w:r>
+              <w:rPr>
+                <w:b/>
+                <w:color w:val="0D382C"/>
+                <w:sz w:val="17"/>
+              </w:rPr>
+              <w:t>HTML5 Design Patterns</w:t>
+            </w:r>
+          </w:p>
+        </w:tc>
         <w:tc>
           <w:tcPr>
             <w:tcW w:type="dxa" w:w="2880"/>
@@ -626,29 +648,7 @@
           <w:p>
             <w:r>
               <w:rPr>
-                <w:b/>
-                <w:color w:val="0D382C"/>
-                <w:sz w:val="18"/>
-              </w:rPr>
-              <w:t>HTML5 Design Patterns</w:t>
-            </w:r>
-          </w:p>
-        </w:tc>
-        <w:tc>
-          <w:tcPr>
-            <w:tcW w:type="dxa" w:w="3168"/>
-            <w:shd w:fill="FFFFFF"/>
-            <w:tcMar>
-              <w:top w:w="100" w:type="dxa"/>
-              <w:bottom w:w="100" w:type="dxa"/>
-              <w:left w:w="100" w:type="dxa"/>
-              <w:right w:w="100" w:type="dxa"/>
-            </w:tcMar>
-          </w:tcPr>
-          <w:p>
-            <w:r>
-              <w:rPr>
-                <w:sz w:val="18"/>
+                <w:sz w:val="17"/>
               </w:rPr>
               <w:t>Semantic Layout &amp; Accessible Structures</w:t>
             </w:r>
@@ -668,7 +668,7 @@
           <w:p>
             <w:r>
               <w:rPr>
-                <w:sz w:val="18"/>
+                <w:sz w:val="17"/>
               </w:rPr>
               <w:t>Semantic landmark tags (&lt;aside&gt;, &lt;main&gt;, &lt;header&gt;, &lt;section&gt;), accessible tables (&lt;caption&gt;, &lt;th scope='col'&gt;), accessible forms.</w:t>
             </w:r>
@@ -687,7 +687,7 @@
         <w:spacing w:before="320" w:after="120"/>
       </w:pPr>
       <w:r>
-        <w:t>3. Document Modeling &amp; Persistence (MongoDB in Action)</w:t>
+        <w:t>3. Document Modeling &amp; Persistence (MongoDB 8.0 in Action by Arek Borucki)</w:t>
       </w:r>
     </w:p>
     <w:tbl>
@@ -728,7 +728,7 @@
                 <w:color w:val="0D382C"/>
                 <w:sz w:val="19"/>
               </w:rPr>
-              <w:t>📌 MONGODB IN ACTION (MANNING)</w:t>
+              <w:t>📌 AREK BORUCKI - CANONICAL CHAPTER CITATIONS</w:t>
               <w:br/>
             </w:r>
             <w:r>
@@ -737,7 +737,17 @@
                 <w:color w:val="28322D"/>
                 <w:sz w:val="19"/>
               </w:rPr>
-              <w:t>MongoDB in Action (Chapters 2, 4, 7): Document modeling should directly reflect the domain query patterns. Use compound indexes for high-frequency multi-key queries and lean on schema validation to guarantee data integrity at the ODM boundary.</w:t>
+              <w:t>Arek Borucki, 'MongoDB 8.0 in Action, Third Edition: Building on the Atlas Data Platform' (Manning):</w:t>
+              <w:br/>
+              <w:t>• Chapter 2 &amp; 3: Working with MongoDB &amp; MongoDB Atlas (Unified connection URIs and Atlas cluster readiness)</w:t>
+              <w:br/>
+              <w:t>• Chapter 4: Document Data Modeling &amp; Schema Design (Direct schema rules, validation constraints, and virtual derivations)</w:t>
+              <w:br/>
+              <w:t>• Chapter 5: CRUD Operations &amp; the MongoDB Query Language (MQL) (Atomic mutations, query filters, and cursor projections)</w:t>
+              <w:br/>
+              <w:t>• Chapter 6: The Aggregation Framework (Multi-stage pipelines for analytics and summary metrics)</w:t>
+              <w:br/>
+              <w:t>• Chapter 7: Indexing Strategies &amp; Query Optimization (Compound indexing on multi-predicate access paths)</w:t>
             </w:r>
           </w:p>
         </w:tc>
@@ -750,30 +760,46 @@
     </w:p>
     <w:p>
       <w:r>
-        <w:t>In Gotera, document models are implemented in server/models/ following Manning's document modeling conventions:</w:t>
+        <w:t>In Gotera, document models are implemented in server/models/ following Arek Borucki's MongoDB 8.0 patterns:</w:t>
       </w:r>
     </w:p>
     <w:p>
       <w:r>
-        <w:t>1. Direct Schema Definition (InventoryItem.js):</w:t>
+        <w:t>1. Chapter 4 - Document Data Modeling &amp; Schema Design (InventoryItem.js &amp; Warehouse.js):</w:t>
         <w:br/>
-        <w:t>Food line items are modeled with typed fields: name (String, indexed), category (String, enum validated), quantity (Number, min constraint: 0), unit (String, enum: t, kg, L), warehouse (String, indexed), and status (enum: 'In Stock', 'Low Stock', 'Critical', 'Expiring Soon').</w:t>
-        <w:br/>
-        <w:t>Compound Indexing: As taught in Chapter 7, a compound index { category: 1, warehouse: 1 } was created to optimize high-volume catalog queries when regional officers filter food stock by both category and depot location.</w:t>
+        <w:t>Borucki emphasizes designing documents around the access patterns of the domain. In InventoryItem.js, each document contains strict type definitions and validation rules (name: String required, category: enum validated, quantity: min 0). In Warehouse.js, rather than repeatedly writing derived percentages into the document, a computed virtual property 'capacityUsedPercent' (Ch. 4 &amp; 6) dynamically evaluates Math.round((currentStock / totalCapacity) * 100). This maintains document cleanliness and eliminates stale cache anomalies.</w:t>
       </w:r>
     </w:p>
     <w:p>
       <w:r>
-        <w:t>2. Computed Virtuals &amp; Field Validation (Warehouse.js):</w:t>
+        <w:t>2. Chapter 7 - Indexing Strategies &amp; Query Optimization (InventoryItem.js &amp; CollectionRecord.js):</w:t>
         <w:br/>
-        <w:t>In accordance with MongoDB document design, operational utilization is derived dynamically. A Mongoose virtual getter 'capacityUsedPercent' calculates Math.round((currentStock / totalCapacity) * 100). This avoids storing redundant derived state while ensuring zero round-trip overhead on client requests.</w:t>
+        <w:t>As Borucki explains in Chapter 7, queries with multiple equality and range predicates must be supported by compound indexes to prevent full collection scans (COLLSCAN). In InventoryItem.js, we declared the compound index:</w:t>
+        <w:br/>
+        <w:t xml:space="preserve">   inventoryItemSchema.index({ category: 1, warehouse: 1 });</w:t>
+        <w:br/>
+        <w:t>This enables IXSCAN (index scan) execution plans when inventory managers filter grain stocks by both category ('Cereals') and warehouse depot ('Adama Central'). Additionally, unique natural key indexes are declared on CollectionRecord (recordId) and User (email) to enforce relational uniqueness at the database engine tier.</w:t>
       </w:r>
     </w:p>
     <w:p>
       <w:r>
-        <w:t>3. Natural Key Traceability (CollectionRecord.js):</w:t>
+        <w:t>3. Chapter 5 - CRUD Operations &amp; Query Language (MQL) (inventoryHandlers.js &amp; collectionHandlers.js):</w:t>
         <w:br/>
-        <w:t>Shipment records utilize natural unique identifiers (e.g., 'GC-2026-1187') indexed with unique: true. The collection pipeline tracks donor source, collection date, destination warehouse, and inspection status.</w:t>
+        <w:t>All data access in server/handlers/ adheres to MongoDB 8.0 MQL conventions: regex text search ($regex with $options: 'i'), disjunctive filter matching ($or), projection, and atomic updates (findByIdAndUpdate with { new: true, runValidators: true }).</w:t>
+      </w:r>
+    </w:p>
+    <w:p>
+      <w:r>
+        <w:t>4. Chapter 6 - The Aggregation Framework (statsHandlers.js):</w:t>
+        <w:br/>
+        <w:t>In statsHandlers.js, overview metrics (total reserve volume, warehouse operational statuses, inspection counts) are aggregated across collections, modeling Borucki's Chapter 6 pipeline principles (filtering with $match, aggregating net tonnage with $sum, and grouping by operational status).</w:t>
+      </w:r>
+    </w:p>
+    <w:p>
+      <w:r>
+        <w:t>5. Chapter 2 &amp; 3 - Working with MongoDB &amp; MongoDB Atlas (connection.js):</w:t>
+        <w:br/>
+        <w:t>The connection layer in server/db/connection.js is fully compliant with the MongoDB Atlas Data Platform URI scheme. It supports standard mongodb:// and mongodb+srv:// Atlas URIs via MONGODB_URI, while providing an educational fallback store that mirrors the exact same MQL interface for instant zero-config testing.</w:t>
       </w:r>
     </w:p>
     <w:p>
@@ -2020,7 +2046,7 @@
         <w:t>The Gotera National Emergency Management System demonstrates that adhering strictly to canonical engineering literature produces software that is remarkably clean, robust, and maintainable. By resisting the urge to introduce unnecessary modern boilerplate, state containers, and microservices, the resulting codebase remains transparent, legible, and directly instructive for case study evaluation.</w:t>
         <w:br/>
         <w:br/>
-        <w:t>Through MongoDB in Action's document patterns, Ethan Brown's Express routing architecture, Alex Banks and Eve Porcello's functional React paradigms, Keith J. Grant's cascade-driven CSS, and HTML5 Design Patterns, Gotera stands as a gold standard educational case study for full-stack web application development.</w:t>
+        <w:t>Through the principles of 'MongoDB 8.0 in Action, Third Edition: Building on the Atlas Data Platform' by Arek Borucki (Chapters 2, 3, 4, 5, 6, and 7), Ethan Brown's Express routing architecture, Alex Banks and Eve Porcello's functional React paradigms, Keith J. Grant's cascade-driven CSS, and HTML5 Design Patterns, Gotera stands as a gold standard educational case study for full-stack web application development.</w:t>
       </w:r>
     </w:p>
     <w:sectPr>

</xml_diff>